<commit_message>
Exclude patterns ignore case; 0.9.8
-exclude '*.png' skipped photo.png but not Screenshot.PNG or IMG.Png:
glob and path-substring matching was case-sensitive. Patterns now match
regardless of case on every platform. Multi-line errors from external
tools (tesseract) are flattened to one line in the unreadable-files list.

Co-Authored-By: Claude Fable 5.1 <noreply@anthropic.com>
</commit_message>
<xml_diff>
--- a/docs/PrivacyLens-User-Guide.docx
+++ b/docs/PrivacyLens-User-Guide.docx
@@ -59,7 +59,7 @@
           <w:sz w:val="22"/>
           <w:szCs w:val="22"/>
         </w:rPr>
-        <w:t xml:space="preserve">Version 0.9.7</w:t>
+        <w:t xml:space="preserve">Version 0.9.8</w:t>
       </w:r>
     </w:p>
     <w:p>
@@ -3749,7 +3749,7 @@
                 <w:sz w:val="20"/>
                 <w:szCs w:val="20"/>
               </w:rPr>
-              <w:t xml:space="preserve">Patterns to skip. Matched against file and folder names (globs like *.bak) and path substrings; matching a folder prunes its whole subtree.</w:t>
+              <w:t xml:space="preserve">Patterns to skip. Matched against file and folder names (globs like *.bak) and path substrings, ignoring case (*.png also skips Photo.PNG); matching a folder prunes its whole subtree.</w:t>
             </w:r>
           </w:p>
         </w:tc>
@@ -10312,7 +10312,7 @@
         <w:sz w:val="17"/>
         <w:szCs w:val="17"/>
       </w:rPr>
-      <w:t xml:space="preserve">	v0.9.7</w:t>
+      <w:t xml:space="preserve">	v0.9.8</w:t>
     </w:r>
   </w:p>
 </w:hdr>

</xml_diff>

<commit_message>
GUI: accept space-separated exclusions, show unreadable files; 0.9.9
The exclusions box said comma-separated, but "*.png *.jpg" silently
became one pattern that matched nothing. Items are now split on commas,
semicolons, and - when every piece is clearly a pattern - spaces, so a
folder name with a space stays whole. Files that could not be read now
get a card and a list; before, they were invisible in the GUI.

Co-Authored-By: Claude Fable 5.1 <noreply@anthropic.com>
</commit_message>
<xml_diff>
--- a/docs/PrivacyLens-User-Guide.docx
+++ b/docs/PrivacyLens-User-Guide.docx
@@ -59,7 +59,7 @@
           <w:sz w:val="22"/>
           <w:szCs w:val="22"/>
         </w:rPr>
-        <w:t xml:space="preserve">Version 0.9.8</w:t>
+        <w:t xml:space="preserve">Version 0.9.9</w:t>
       </w:r>
     </w:p>
     <w:p>
@@ -10312,7 +10312,7 @@
         <w:sz w:val="17"/>
         <w:szCs w:val="17"/>
       </w:rPr>
-      <w:t xml:space="preserve">	v0.9.8</w:t>
+      <w:t xml:space="preserve">	v0.9.9</w:t>
     </w:r>
   </w:p>
 </w:hdr>

</xml_diff>